<commit_message>
docs: add user screenshots to project and embed in report
</commit_message>
<xml_diff>
--- a/Lab05_Akishev_IS-2406.docx
+++ b/Lab05_Akishev_IS-2406.docx
@@ -544,6 +544,67 @@
         <w:t>• src/main/resources/static/index.html: Static welcome page automatically bound by WelcomePageHandlerMapping.</w:t>
         <w:br/>
         <w:t>• lab05-requests.http: Dedicated IntelliJ IDEA HTTP Client request file for interactive testing and demonstration directly inside the IDE editor.</w:t>
+      </w:r>
+    </w:p>
+    <w:p>
+      <w:pPr>
+        <w:spacing w:before="120"/>
+      </w:pPr>
+    </w:p>
+    <w:p>
+      <w:pPr>
+        <w:spacing w:after="60"/>
+        <w:jc w:val="center"/>
+      </w:pPr>
+    </w:p>
+    <w:p>
+      <w:r>
+        <w:drawing>
+          <wp:inline xmlns:a="http://schemas.openxmlformats.org/drawingml/2006/main" xmlns:pic="http://schemas.openxmlformats.org/drawingml/2006/picture">
+            <wp:extent cx="5669280" cy="3011805"/>
+            <wp:docPr id="1" name="Picture 1"/>
+            <wp:cNvGraphicFramePr>
+              <a:graphicFrameLocks noChangeAspect="1"/>
+            </wp:cNvGraphicFramePr>
+            <a:graphic>
+              <a:graphicData uri="http://schemas.openxmlformats.org/drawingml/2006/picture">
+                <pic:pic>
+                  <pic:nvPicPr>
+                    <pic:cNvPr id="0" name="screenshot_two_controllers.png"/>
+                    <pic:cNvPicPr/>
+                  </pic:nvPicPr>
+                  <pic:blipFill>
+                    <a:blip r:embed="rId9"/>
+                    <a:stretch>
+                      <a:fillRect/>
+                    </a:stretch>
+                  </pic:blipFill>
+                  <pic:spPr>
+                    <a:xfrm>
+                      <a:off x="0" y="0"/>
+                      <a:ext cx="5669280" cy="3011805"/>
+                    </a:xfrm>
+                    <a:prstGeom prst="rect"/>
+                  </pic:spPr>
+                </pic:pic>
+              </a:graphicData>
+            </a:graphic>
+          </wp:inline>
+        </w:drawing>
+      </w:r>
+    </w:p>
+    <w:p>
+      <w:pPr>
+        <w:spacing w:after="160"/>
+        <w:jc w:val="center"/>
+      </w:pPr>
+      <w:r>
+        <w:rPr>
+          <w:b/>
+          <w:color w:val="334455"/>
+          <w:sz w:val="19"/>
+        </w:rPr>
+        <w:t>Figure 1: Side-by-side view of BookRestController (@RestController) and BookPageController (@Controller) in IntelliJ IDEA</w:t>
       </w:r>
     </w:p>
     <w:p>
@@ -2056,7 +2117,7 @@
     </w:p>
     <w:p>
       <w:pPr>
-        <w:spacing w:after="40"/>
+        <w:spacing w:after="60"/>
         <w:jc w:val="center"/>
       </w:pPr>
     </w:p>
@@ -2064,8 +2125,8 @@
       <w:r>
         <w:drawing>
           <wp:inline xmlns:a="http://schemas.openxmlformats.org/drawingml/2006/main" xmlns:pic="http://schemas.openxmlformats.org/drawingml/2006/picture">
-            <wp:extent cx="5486400" cy="3657600"/>
-            <wp:docPr id="1" name="Picture 1"/>
+            <wp:extent cx="5669280" cy="3019669"/>
+            <wp:docPr id="2" name="Picture 2"/>
             <wp:cNvGraphicFramePr>
               <a:graphicFrameLocks noChangeAspect="1"/>
             </wp:cNvGraphicFramePr>
@@ -2077,7 +2138,7 @@
                     <pic:cNvPicPr/>
                   </pic:nvPicPr>
                   <pic:blipFill>
-                    <a:blip r:embed="rId9"/>
+                    <a:blip r:embed="rId10"/>
                     <a:stretch>
                       <a:fillRect/>
                     </a:stretch>
@@ -2085,7 +2146,7 @@
                   <pic:spPr>
                     <a:xfrm>
                       <a:off x="0" y="0"/>
-                      <a:ext cx="5486400" cy="3657600"/>
+                      <a:ext cx="5669280" cy="3019669"/>
                     </a:xfrm>
                     <a:prstGeom prst="rect"/>
                   </pic:spPr>
@@ -2107,7 +2168,7 @@
           <w:color w:val="334455"/>
           <w:sz w:val="19"/>
         </w:rPr>
-        <w:t>Figure 1: Catalogue page (/books) rendered with CSS stylesheet</w:t>
+        <w:t>Figure 2: Catalogue page (/books) rendered in browser with CSS stylesheet</w:t>
       </w:r>
     </w:p>
     <w:p>
@@ -2117,7 +2178,7 @@
     </w:p>
     <w:p>
       <w:pPr>
-        <w:spacing w:after="40"/>
+        <w:spacing w:after="60"/>
         <w:jc w:val="center"/>
       </w:pPr>
     </w:p>
@@ -2125,8 +2186,8 @@
       <w:r>
         <w:drawing>
           <wp:inline xmlns:a="http://schemas.openxmlformats.org/drawingml/2006/main" xmlns:pic="http://schemas.openxmlformats.org/drawingml/2006/picture">
-            <wp:extent cx="5486400" cy="3657600"/>
-            <wp:docPr id="2" name="Picture 2"/>
+            <wp:extent cx="5669280" cy="3019476"/>
+            <wp:docPr id="3" name="Picture 3"/>
             <wp:cNvGraphicFramePr>
               <a:graphicFrameLocks noChangeAspect="1"/>
             </wp:cNvGraphicFramePr>
@@ -2138,7 +2199,7 @@
                     <pic:cNvPicPr/>
                   </pic:nvPicPr>
                   <pic:blipFill>
-                    <a:blip r:embed="rId10"/>
+                    <a:blip r:embed="rId11"/>
                     <a:stretch>
                       <a:fillRect/>
                     </a:stretch>
@@ -2146,7 +2207,7 @@
                   <pic:spPr>
                     <a:xfrm>
                       <a:off x="0" y="0"/>
-                      <a:ext cx="5486400" cy="3657600"/>
+                      <a:ext cx="5669280" cy="3019476"/>
                     </a:xfrm>
                     <a:prstGeom prst="rect"/>
                   </pic:spPr>
@@ -2168,7 +2229,7 @@
           <w:color w:val="334455"/>
           <w:sz w:val="19"/>
         </w:rPr>
-        <w:t>Figure 2: Catalogue page filtered by author (/books?author=Bloch)</w:t>
+        <w:t>Figure 3: Catalogue page filtered by author (/books?author=Bloch)</w:t>
       </w:r>
     </w:p>
     <w:p>
@@ -2178,7 +2239,7 @@
     </w:p>
     <w:p>
       <w:pPr>
-        <w:spacing w:after="40"/>
+        <w:spacing w:after="60"/>
         <w:jc w:val="center"/>
       </w:pPr>
     </w:p>
@@ -2186,8 +2247,8 @@
       <w:r>
         <w:drawing>
           <wp:inline xmlns:a="http://schemas.openxmlformats.org/drawingml/2006/main" xmlns:pic="http://schemas.openxmlformats.org/drawingml/2006/picture">
-            <wp:extent cx="5486400" cy="3657600"/>
-            <wp:docPr id="3" name="Picture 3"/>
+            <wp:extent cx="5669280" cy="3013374"/>
+            <wp:docPr id="4" name="Picture 4"/>
             <wp:cNvGraphicFramePr>
               <a:graphicFrameLocks noChangeAspect="1"/>
             </wp:cNvGraphicFramePr>
@@ -2199,7 +2260,7 @@
                     <pic:cNvPicPr/>
                   </pic:nvPicPr>
                   <pic:blipFill>
-                    <a:blip r:embed="rId11"/>
+                    <a:blip r:embed="rId12"/>
                     <a:stretch>
                       <a:fillRect/>
                     </a:stretch>
@@ -2207,7 +2268,7 @@
                   <pic:spPr>
                     <a:xfrm>
                       <a:off x="0" y="0"/>
-                      <a:ext cx="5486400" cy="3657600"/>
+                      <a:ext cx="5669280" cy="3013374"/>
                     </a:xfrm>
                     <a:prstGeom prst="rect"/>
                   </pic:spPr>
@@ -2229,7 +2290,7 @@
           <w:color w:val="334455"/>
           <w:sz w:val="19"/>
         </w:rPr>
-        <w:t>Figure 3: Flash message displayed after POST submission using Post/Redirect/Get</w:t>
+        <w:t>Figure 4: Flash message displayed after POST submission using Post/Redirect/Get (session cookie attached)</w:t>
       </w:r>
     </w:p>
     <w:p>
@@ -2819,24 +2880,133 @@
     <w:p/>
     <w:p>
       <w:r>
-        <w:t>Experimental Verification:</w:t>
+        <w:t>Experimental Verification via IntelliJ IDEA HTTP Client:</w:t>
         <w:br/>
-        <w:t>1. Valid 4-digit year request: curl -i http://localhost:8080/api/books/by-year/2022</w:t>
+        <w:t>1. Valid 4-digit year request: GET http://localhost:8080/api/books/by-year/2022 yields HTTP/1.1 200 OK and returns the matching book records.</w:t>
         <w:br/>
-        <w:t xml:space="preserve">   Status: HTTP/1.1 200 OK</w:t>
-        <w:br/>
-        <w:t xml:space="preserve">   Response Body: [{"id":3,"title":"Spring in Action","author":"Craig Walls","year":2022}]</w:t>
-        <w:br/>
-        <w:t xml:space="preserve">   Explanation: The path segment "2022" matches the \d{4} regular expression. Spring binds the variable to int year and returns the matching books.</w:t>
-        <w:br/>
-        <w:br/>
-        <w:t>2. Invalid non-4-digit path variable: curl -i http://localhost:8080/api/books/by-year/abc</w:t>
-        <w:br/>
-        <w:t xml:space="preserve">   Status: HTTP/1.1 404 Not Found</w:t>
-        <w:br/>
-        <w:t xml:space="preserve">   Response Body: {"timestamp":"...","status":404,"error":"Not Found","message":"No static resource api/books/by-year/abc.","path":"/api/books/by-year/abc"}</w:t>
-        <w:br/>
-        <w:t xml:space="preserve">   Explanation: Because "abc" fails the \d{4} regex pattern, RequestMappingInfoHandlerMapping considers this route non-matching. Since no other controller handles /api/books/by-year/abc, DispatcherServlet immediately yields 404 Not Found, precisely fulfilling the laboratory variant specification.</w:t>
+        <w:t>2. Invalid non-4-digit path request: GET http://localhost:8080/api/books/by-year/abc yields HTTP/1.1 404 Not Found because the regex \d{4} does not match.</w:t>
+      </w:r>
+    </w:p>
+    <w:p>
+      <w:pPr>
+        <w:spacing w:before="120"/>
+      </w:pPr>
+    </w:p>
+    <w:p>
+      <w:pPr>
+        <w:spacing w:after="60"/>
+        <w:jc w:val="center"/>
+      </w:pPr>
+    </w:p>
+    <w:p>
+      <w:r>
+        <w:drawing>
+          <wp:inline xmlns:a="http://schemas.openxmlformats.org/drawingml/2006/main" xmlns:pic="http://schemas.openxmlformats.org/drawingml/2006/picture">
+            <wp:extent cx="5669280" cy="3006269"/>
+            <wp:docPr id="5" name="Picture 5"/>
+            <wp:cNvGraphicFramePr>
+              <a:graphicFrameLocks noChangeAspect="1"/>
+            </wp:cNvGraphicFramePr>
+            <a:graphic>
+              <a:graphicData uri="http://schemas.openxmlformats.org/drawingml/2006/picture">
+                <pic:pic>
+                  <pic:nvPicPr>
+                    <pic:cNvPr id="0" name="screenshot_variant2_match.png"/>
+                    <pic:cNvPicPr/>
+                  </pic:nvPicPr>
+                  <pic:blipFill>
+                    <a:blip r:embed="rId13"/>
+                    <a:stretch>
+                      <a:fillRect/>
+                    </a:stretch>
+                  </pic:blipFill>
+                  <pic:spPr>
+                    <a:xfrm>
+                      <a:off x="0" y="0"/>
+                      <a:ext cx="5669280" cy="3006269"/>
+                    </a:xfrm>
+                    <a:prstGeom prst="rect"/>
+                  </pic:spPr>
+                </pic:pic>
+              </a:graphicData>
+            </a:graphic>
+          </wp:inline>
+        </w:drawing>
+      </w:r>
+    </w:p>
+    <w:p>
+      <w:pPr>
+        <w:spacing w:after="160"/>
+        <w:jc w:val="center"/>
+      </w:pPr>
+      <w:r>
+        <w:rPr>
+          <w:b/>
+          <w:color w:val="334455"/>
+          <w:sz w:val="19"/>
+        </w:rPr>
+        <w:t>Figure 5: Variant 2 valid request (/by-year/2022) returning 200 OK in IntelliJ IDEA HTTP Client</w:t>
+      </w:r>
+    </w:p>
+    <w:p>
+      <w:pPr>
+        <w:spacing w:before="120"/>
+      </w:pPr>
+    </w:p>
+    <w:p>
+      <w:pPr>
+        <w:spacing w:after="60"/>
+        <w:jc w:val="center"/>
+      </w:pPr>
+    </w:p>
+    <w:p>
+      <w:r>
+        <w:drawing>
+          <wp:inline xmlns:a="http://schemas.openxmlformats.org/drawingml/2006/main" xmlns:pic="http://schemas.openxmlformats.org/drawingml/2006/picture">
+            <wp:extent cx="5669280" cy="3017341"/>
+            <wp:docPr id="6" name="Picture 6"/>
+            <wp:cNvGraphicFramePr>
+              <a:graphicFrameLocks noChangeAspect="1"/>
+            </wp:cNvGraphicFramePr>
+            <a:graphic>
+              <a:graphicData uri="http://schemas.openxmlformats.org/drawingml/2006/picture">
+                <pic:pic>
+                  <pic:nvPicPr>
+                    <pic:cNvPr id="0" name="screenshot_variant2_nonmatch.png"/>
+                    <pic:cNvPicPr/>
+                  </pic:nvPicPr>
+                  <pic:blipFill>
+                    <a:blip r:embed="rId14"/>
+                    <a:stretch>
+                      <a:fillRect/>
+                    </a:stretch>
+                  </pic:blipFill>
+                  <pic:spPr>
+                    <a:xfrm>
+                      <a:off x="0" y="0"/>
+                      <a:ext cx="5669280" cy="3017341"/>
+                    </a:xfrm>
+                    <a:prstGeom prst="rect"/>
+                  </pic:spPr>
+                </pic:pic>
+              </a:graphicData>
+            </a:graphic>
+          </wp:inline>
+        </w:drawing>
+      </w:r>
+    </w:p>
+    <w:p>
+      <w:pPr>
+        <w:spacing w:after="160"/>
+        <w:jc w:val="center"/>
+      </w:pPr>
+      <w:r>
+        <w:rPr>
+          <w:b/>
+          <w:color w:val="334455"/>
+          <w:sz w:val="19"/>
+        </w:rPr>
+        <w:t>Figure 6: Variant 2 invalid request (/by-year/abc) returning 404 Not Found due to regex mismatch in IntelliJ IDEA HTTP Client</w:t>
       </w:r>
     </w:p>
     <w:p>
@@ -2856,16 +3026,136 @@
     </w:p>
     <w:p>
       <w:r>
-        <w:t>During testing, http://localhost:8080/css/app.css and http://localhost:8080/ (index.html) answer with HTTP 200 OK without any corresponding @Controller or @GetMapping methods in our Java codebase.</w:t>
+        <w:t>During testing, http://localhost:8080/ (index.html) and http://localhost:8080/css/app.css answer with HTTP 200 OK without any corresponding @Controller or @GetMapping methods in our Java codebase.</w:t>
         <w:br/>
         <w:br/>
         <w:t>Technical Explanation:</w:t>
         <w:br/>
-        <w:t>1. ResourceHttpRequestHandler: Spring Boot auto-configures ResourceHttpRequestHandler mapped to /** that serves static files from standard classpath locations: classpath:/static/, classpath:/public/, classpath:/resources/, and classpath:/META-INF/resources/.</w:t>
+        <w:t>1. WelcomePageHandlerMapping: Spring Boot registers WelcomePageHandlerMapping. When the root URL / is requested, it checks for an index.html file in any configured static resource directory (classpath:/static/index.html) and forwards to it.</w:t>
         <w:br/>
-        <w:t>2. CSS Resolution: When /css/app.css is requested, HandlerMapping finds no matching controller method, so the request falls through to ResourceHttpRequestHandler, which finds src/main/resources/static/css/app.css on the classpath, detects MIME type text/css, and streams the file.</w:t>
-        <w:br/>
-        <w:t>3. Start Page Resolution: Spring Boot registers WelcomePageHandlerMapping. When the root URL / is requested, it checks for an index.html file in any configured static resource directory. Finding src/main/resources/static/index.html, it forwards the request to render the welcome page.</w:t>
+        <w:t>2. ResourceHttpRequestHandler: Spring Boot auto-configures ResourceHttpRequestHandler mapped to /** that serves static files from standard classpath locations: classpath:/static/, classpath:/public/, classpath:/resources/, and classpath:/META-INF/resources/.</w:t>
+      </w:r>
+    </w:p>
+    <w:p>
+      <w:pPr>
+        <w:spacing w:before="120"/>
+      </w:pPr>
+    </w:p>
+    <w:p>
+      <w:pPr>
+        <w:spacing w:after="60"/>
+        <w:jc w:val="center"/>
+      </w:pPr>
+    </w:p>
+    <w:p>
+      <w:r>
+        <w:drawing>
+          <wp:inline xmlns:a="http://schemas.openxmlformats.org/drawingml/2006/main" xmlns:pic="http://schemas.openxmlformats.org/drawingml/2006/picture">
+            <wp:extent cx="5669280" cy="3006269"/>
+            <wp:docPr id="7" name="Picture 7"/>
+            <wp:cNvGraphicFramePr>
+              <a:graphicFrameLocks noChangeAspect="1"/>
+            </wp:cNvGraphicFramePr>
+            <a:graphic>
+              <a:graphicData uri="http://schemas.openxmlformats.org/drawingml/2006/picture">
+                <pic:pic>
+                  <pic:nvPicPr>
+                    <pic:cNvPr id="0" name="screenshot_static_index.png"/>
+                    <pic:cNvPicPr/>
+                  </pic:nvPicPr>
+                  <pic:blipFill>
+                    <a:blip r:embed="rId15"/>
+                    <a:stretch>
+                      <a:fillRect/>
+                    </a:stretch>
+                  </pic:blipFill>
+                  <pic:spPr>
+                    <a:xfrm>
+                      <a:off x="0" y="0"/>
+                      <a:ext cx="5669280" cy="3006269"/>
+                    </a:xfrm>
+                    <a:prstGeom prst="rect"/>
+                  </pic:spPr>
+                </pic:pic>
+              </a:graphicData>
+            </a:graphic>
+          </wp:inline>
+        </w:drawing>
+      </w:r>
+    </w:p>
+    <w:p>
+      <w:pPr>
+        <w:spacing w:after="160"/>
+        <w:jc w:val="center"/>
+      </w:pPr>
+      <w:r>
+        <w:rPr>
+          <w:b/>
+          <w:color w:val="334455"/>
+          <w:sz w:val="19"/>
+        </w:rPr>
+        <w:t>Figure 7: Static start page (/index.html) rendered from classpath:/static/index.html</w:t>
+      </w:r>
+    </w:p>
+    <w:p>
+      <w:pPr>
+        <w:spacing w:before="120"/>
+      </w:pPr>
+    </w:p>
+    <w:p>
+      <w:pPr>
+        <w:spacing w:after="60"/>
+        <w:jc w:val="center"/>
+      </w:pPr>
+    </w:p>
+    <w:p>
+      <w:r>
+        <w:drawing>
+          <wp:inline xmlns:a="http://schemas.openxmlformats.org/drawingml/2006/main" xmlns:pic="http://schemas.openxmlformats.org/drawingml/2006/picture">
+            <wp:extent cx="5669280" cy="3017341"/>
+            <wp:docPr id="8" name="Picture 8"/>
+            <wp:cNvGraphicFramePr>
+              <a:graphicFrameLocks noChangeAspect="1"/>
+            </wp:cNvGraphicFramePr>
+            <a:graphic>
+              <a:graphicData uri="http://schemas.openxmlformats.org/drawingml/2006/picture">
+                <pic:pic>
+                  <pic:nvPicPr>
+                    <pic:cNvPr id="0" name="screenshot_static_css.png"/>
+                    <pic:cNvPicPr/>
+                  </pic:nvPicPr>
+                  <pic:blipFill>
+                    <a:blip r:embed="rId16"/>
+                    <a:stretch>
+                      <a:fillRect/>
+                    </a:stretch>
+                  </pic:blipFill>
+                  <pic:spPr>
+                    <a:xfrm>
+                      <a:off x="0" y="0"/>
+                      <a:ext cx="5669280" cy="3017341"/>
+                    </a:xfrm>
+                    <a:prstGeom prst="rect"/>
+                  </pic:spPr>
+                </pic:pic>
+              </a:graphicData>
+            </a:graphic>
+          </wp:inline>
+        </w:drawing>
+      </w:r>
+    </w:p>
+    <w:p>
+      <w:pPr>
+        <w:spacing w:after="160"/>
+        <w:jc w:val="center"/>
+      </w:pPr>
+      <w:r>
+        <w:rPr>
+          <w:b/>
+          <w:color w:val="334455"/>
+          <w:sz w:val="19"/>
+        </w:rPr>
+        <w:t>Figure 8: Static stylesheet (/css/app.css) served directly by ResourceHttpRequestHandler</w:t>
       </w:r>
     </w:p>
     <w:p>

</xml_diff>

<commit_message>
docs: add official Pull Request #4 link and screenshot to lab05 report
</commit_message>
<xml_diff>
--- a/Lab05_Akishev_IS-2406.docx
+++ b/Lab05_Akishev_IS-2406.docx
@@ -74,8 +74,8 @@
             <w:tcW w:type="dxa" w:w="4968"/>
             <w:shd w:fill="F8FAFC"/>
             <w:tcMar>
-              <w:top w:w="60" w:type="dxa"/>
-              <w:bottom w:w="60" w:type="dxa"/>
+              <w:top w:w="55" w:type="dxa"/>
+              <w:bottom w:w="55" w:type="dxa"/>
               <w:left w:w="100" w:type="dxa"/>
               <w:right w:w="100" w:type="dxa"/>
             </w:tcMar>
@@ -87,7 +87,7 @@
             <w:r>
               <w:rPr>
                 <w:b/>
-                <w:sz w:val="20"/>
+                <w:sz w:val="19"/>
               </w:rPr>
               <w:t>Course:</w:t>
             </w:r>
@@ -98,8 +98,8 @@
             <w:tcW w:type="dxa" w:w="4968"/>
             <w:shd w:fill="FFFFFF"/>
             <w:tcMar>
-              <w:top w:w="60" w:type="dxa"/>
-              <w:bottom w:w="60" w:type="dxa"/>
+              <w:top w:w="55" w:type="dxa"/>
+              <w:bottom w:w="55" w:type="dxa"/>
               <w:left w:w="100" w:type="dxa"/>
               <w:right w:w="100" w:type="dxa"/>
             </w:tcMar>
@@ -110,7 +110,7 @@
             </w:pPr>
             <w:r>
               <w:rPr>
-                <w:sz w:val="20"/>
+                <w:sz w:val="19"/>
               </w:rPr>
               <w:t>RWPSF 3305 — Web Application Development with Spring Framework</w:t>
             </w:r>
@@ -123,8 +123,8 @@
             <w:tcW w:type="dxa" w:w="4968"/>
             <w:shd w:fill="F8FAFC"/>
             <w:tcMar>
-              <w:top w:w="60" w:type="dxa"/>
-              <w:bottom w:w="60" w:type="dxa"/>
+              <w:top w:w="55" w:type="dxa"/>
+              <w:bottom w:w="55" w:type="dxa"/>
               <w:left w:w="100" w:type="dxa"/>
               <w:right w:w="100" w:type="dxa"/>
             </w:tcMar>
@@ -136,7 +136,7 @@
             <w:r>
               <w:rPr>
                 <w:b/>
-                <w:sz w:val="20"/>
+                <w:sz w:val="19"/>
               </w:rPr>
               <w:t>Educational Programme:</w:t>
             </w:r>
@@ -147,8 +147,8 @@
             <w:tcW w:type="dxa" w:w="4968"/>
             <w:shd w:fill="FFFFFF"/>
             <w:tcMar>
-              <w:top w:w="60" w:type="dxa"/>
-              <w:bottom w:w="60" w:type="dxa"/>
+              <w:top w:w="55" w:type="dxa"/>
+              <w:bottom w:w="55" w:type="dxa"/>
               <w:left w:w="100" w:type="dxa"/>
               <w:right w:w="100" w:type="dxa"/>
             </w:tcMar>
@@ -159,7 +159,7 @@
             </w:pPr>
             <w:r>
               <w:rPr>
-                <w:sz w:val="20"/>
+                <w:sz w:val="19"/>
               </w:rPr>
               <w:t>6B06105 — Information Systems, year 3, semester 6</w:t>
             </w:r>
@@ -172,8 +172,8 @@
             <w:tcW w:type="dxa" w:w="4968"/>
             <w:shd w:fill="F8FAFC"/>
             <w:tcMar>
-              <w:top w:w="60" w:type="dxa"/>
-              <w:bottom w:w="60" w:type="dxa"/>
+              <w:top w:w="55" w:type="dxa"/>
+              <w:bottom w:w="55" w:type="dxa"/>
               <w:left w:w="100" w:type="dxa"/>
               <w:right w:w="100" w:type="dxa"/>
             </w:tcMar>
@@ -185,7 +185,7 @@
             <w:r>
               <w:rPr>
                 <w:b/>
-                <w:sz w:val="20"/>
+                <w:sz w:val="19"/>
               </w:rPr>
               <w:t>Student:</w:t>
             </w:r>
@@ -196,8 +196,8 @@
             <w:tcW w:type="dxa" w:w="4968"/>
             <w:shd w:fill="FFFFFF"/>
             <w:tcMar>
-              <w:top w:w="60" w:type="dxa"/>
-              <w:bottom w:w="60" w:type="dxa"/>
+              <w:top w:w="55" w:type="dxa"/>
+              <w:bottom w:w="55" w:type="dxa"/>
               <w:left w:w="100" w:type="dxa"/>
               <w:right w:w="100" w:type="dxa"/>
             </w:tcMar>
@@ -208,7 +208,7 @@
             </w:pPr>
             <w:r>
               <w:rPr>
-                <w:sz w:val="20"/>
+                <w:sz w:val="19"/>
               </w:rPr>
               <w:t>Akishev Adilkhan</w:t>
             </w:r>
@@ -221,8 +221,8 @@
             <w:tcW w:type="dxa" w:w="4968"/>
             <w:shd w:fill="F8FAFC"/>
             <w:tcMar>
-              <w:top w:w="60" w:type="dxa"/>
-              <w:bottom w:w="60" w:type="dxa"/>
+              <w:top w:w="55" w:type="dxa"/>
+              <w:bottom w:w="55" w:type="dxa"/>
               <w:left w:w="100" w:type="dxa"/>
               <w:right w:w="100" w:type="dxa"/>
             </w:tcMar>
@@ -234,7 +234,7 @@
             <w:r>
               <w:rPr>
                 <w:b/>
-                <w:sz w:val="20"/>
+                <w:sz w:val="19"/>
               </w:rPr>
               <w:t>Group:</w:t>
             </w:r>
@@ -245,8 +245,8 @@
             <w:tcW w:type="dxa" w:w="4968"/>
             <w:shd w:fill="FFFFFF"/>
             <w:tcMar>
-              <w:top w:w="60" w:type="dxa"/>
-              <w:bottom w:w="60" w:type="dxa"/>
+              <w:top w:w="55" w:type="dxa"/>
+              <w:bottom w:w="55" w:type="dxa"/>
               <w:left w:w="100" w:type="dxa"/>
               <w:right w:w="100" w:type="dxa"/>
             </w:tcMar>
@@ -257,7 +257,7 @@
             </w:pPr>
             <w:r>
               <w:rPr>
-                <w:sz w:val="20"/>
+                <w:sz w:val="19"/>
               </w:rPr>
               <w:t>IS-2406 (2406IS)</w:t>
             </w:r>
@@ -270,8 +270,8 @@
             <w:tcW w:type="dxa" w:w="4968"/>
             <w:shd w:fill="F8FAFC"/>
             <w:tcMar>
-              <w:top w:w="60" w:type="dxa"/>
-              <w:bottom w:w="60" w:type="dxa"/>
+              <w:top w:w="55" w:type="dxa"/>
+              <w:bottom w:w="55" w:type="dxa"/>
               <w:left w:w="100" w:type="dxa"/>
               <w:right w:w="100" w:type="dxa"/>
             </w:tcMar>
@@ -283,7 +283,7 @@
             <w:r>
               <w:rPr>
                 <w:b/>
-                <w:sz w:val="20"/>
+                <w:sz w:val="19"/>
               </w:rPr>
               <w:t>Variant:</w:t>
             </w:r>
@@ -294,8 +294,8 @@
             <w:tcW w:type="dxa" w:w="4968"/>
             <w:shd w:fill="FFFFFF"/>
             <w:tcMar>
-              <w:top w:w="60" w:type="dxa"/>
-              <w:bottom w:w="60" w:type="dxa"/>
+              <w:top w:w="55" w:type="dxa"/>
+              <w:bottom w:w="55" w:type="dxa"/>
               <w:left w:w="100" w:type="dxa"/>
               <w:right w:w="100" w:type="dxa"/>
             </w:tcMar>
@@ -306,7 +306,7 @@
             </w:pPr>
             <w:r>
               <w:rPr>
-                <w:sz w:val="20"/>
+                <w:sz w:val="19"/>
               </w:rPr>
               <w:t>2 (GET /api/books/by-year/{year} constrained by regex to 4 digits)</w:t>
             </w:r>
@@ -319,8 +319,8 @@
             <w:tcW w:type="dxa" w:w="4968"/>
             <w:shd w:fill="F8FAFC"/>
             <w:tcMar>
-              <w:top w:w="60" w:type="dxa"/>
-              <w:bottom w:w="60" w:type="dxa"/>
+              <w:top w:w="55" w:type="dxa"/>
+              <w:bottom w:w="55" w:type="dxa"/>
               <w:left w:w="100" w:type="dxa"/>
               <w:right w:w="100" w:type="dxa"/>
             </w:tcMar>
@@ -332,7 +332,7 @@
             <w:r>
               <w:rPr>
                 <w:b/>
-                <w:sz w:val="20"/>
+                <w:sz w:val="19"/>
               </w:rPr>
               <w:t>Lecturer:</w:t>
             </w:r>
@@ -343,8 +343,8 @@
             <w:tcW w:type="dxa" w:w="4968"/>
             <w:shd w:fill="FFFFFF"/>
             <w:tcMar>
-              <w:top w:w="60" w:type="dxa"/>
-              <w:bottom w:w="60" w:type="dxa"/>
+              <w:top w:w="55" w:type="dxa"/>
+              <w:bottom w:w="55" w:type="dxa"/>
               <w:left w:w="100" w:type="dxa"/>
               <w:right w:w="100" w:type="dxa"/>
             </w:tcMar>
@@ -355,7 +355,7 @@
             </w:pPr>
             <w:r>
               <w:rPr>
-                <w:sz w:val="20"/>
+                <w:sz w:val="19"/>
               </w:rPr>
               <w:t>Yemberdiyeva Aknur, Senior Lector</w:t>
             </w:r>
@@ -368,8 +368,8 @@
             <w:tcW w:type="dxa" w:w="4968"/>
             <w:shd w:fill="F8FAFC"/>
             <w:tcMar>
-              <w:top w:w="60" w:type="dxa"/>
-              <w:bottom w:w="60" w:type="dxa"/>
+              <w:top w:w="55" w:type="dxa"/>
+              <w:bottom w:w="55" w:type="dxa"/>
               <w:left w:w="100" w:type="dxa"/>
               <w:right w:w="100" w:type="dxa"/>
             </w:tcMar>
@@ -381,7 +381,7 @@
             <w:r>
               <w:rPr>
                 <w:b/>
-                <w:sz w:val="20"/>
+                <w:sz w:val="19"/>
               </w:rPr>
               <w:t>Repository:</w:t>
             </w:r>
@@ -392,8 +392,8 @@
             <w:tcW w:type="dxa" w:w="4968"/>
             <w:shd w:fill="FFFFFF"/>
             <w:tcMar>
-              <w:top w:w="60" w:type="dxa"/>
-              <w:bottom w:w="60" w:type="dxa"/>
+              <w:top w:w="55" w:type="dxa"/>
+              <w:bottom w:w="55" w:type="dxa"/>
               <w:left w:w="100" w:type="dxa"/>
               <w:right w:w="100" w:type="dxa"/>
             </w:tcMar>
@@ -404,7 +404,7 @@
             </w:pPr>
             <w:r>
               <w:rPr>
-                <w:sz w:val="20"/>
+                <w:sz w:val="19"/>
               </w:rPr>
               <w:t>https://github.com/adilkhanakishev/spring-lab-01 (branch: lab05)</w:t>
             </w:r>
@@ -417,8 +417,8 @@
             <w:tcW w:type="dxa" w:w="4968"/>
             <w:shd w:fill="F8FAFC"/>
             <w:tcMar>
-              <w:top w:w="60" w:type="dxa"/>
-              <w:bottom w:w="60" w:type="dxa"/>
+              <w:top w:w="55" w:type="dxa"/>
+              <w:bottom w:w="55" w:type="dxa"/>
               <w:left w:w="100" w:type="dxa"/>
               <w:right w:w="100" w:type="dxa"/>
             </w:tcMar>
@@ -430,7 +430,56 @@
             <w:r>
               <w:rPr>
                 <w:b/>
-                <w:sz w:val="20"/>
+                <w:sz w:val="19"/>
+              </w:rPr>
+              <w:t>Pull Request:</w:t>
+            </w:r>
+          </w:p>
+        </w:tc>
+        <w:tc>
+          <w:tcPr>
+            <w:tcW w:type="dxa" w:w="4968"/>
+            <w:shd w:fill="FFFFFF"/>
+            <w:tcMar>
+              <w:top w:w="55" w:type="dxa"/>
+              <w:bottom w:w="55" w:type="dxa"/>
+              <w:left w:w="100" w:type="dxa"/>
+              <w:right w:w="100" w:type="dxa"/>
+            </w:tcMar>
+          </w:tcPr>
+          <w:p>
+            <w:pPr>
+              <w:spacing w:before="20" w:after="20"/>
+            </w:pPr>
+            <w:r>
+              <w:rPr>
+                <w:sz w:val="19"/>
+              </w:rPr>
+              <w:t>https://github.com/adilkhanakishev/spring-lab-01/pull/4</w:t>
+            </w:r>
+          </w:p>
+        </w:tc>
+      </w:tr>
+      <w:tr>
+        <w:tc>
+          <w:tcPr>
+            <w:tcW w:type="dxa" w:w="4968"/>
+            <w:shd w:fill="F8FAFC"/>
+            <w:tcMar>
+              <w:top w:w="55" w:type="dxa"/>
+              <w:bottom w:w="55" w:type="dxa"/>
+              <w:left w:w="100" w:type="dxa"/>
+              <w:right w:w="100" w:type="dxa"/>
+            </w:tcMar>
+          </w:tcPr>
+          <w:p>
+            <w:pPr>
+              <w:spacing w:before="20" w:after="20"/>
+            </w:pPr>
+            <w:r>
+              <w:rPr>
+                <w:b/>
+                <w:sz w:val="19"/>
               </w:rPr>
               <w:t>Environment:</w:t>
             </w:r>
@@ -441,8 +490,8 @@
             <w:tcW w:type="dxa" w:w="4968"/>
             <w:shd w:fill="FFFFFF"/>
             <w:tcMar>
-              <w:top w:w="60" w:type="dxa"/>
-              <w:bottom w:w="60" w:type="dxa"/>
+              <w:top w:w="55" w:type="dxa"/>
+              <w:bottom w:w="55" w:type="dxa"/>
               <w:left w:w="100" w:type="dxa"/>
               <w:right w:w="100" w:type="dxa"/>
             </w:tcMar>
@@ -453,7 +502,7 @@
             </w:pPr>
             <w:r>
               <w:rPr>
-                <w:sz w:val="20"/>
+                <w:sz w:val="19"/>
               </w:rPr>
               <w:t>IntelliJ IDEA, Java 25 LTS, Spring Boot 4.1.1, Spring MVC 7.0.9</w:t>
             </w:r>
@@ -463,7 +512,7 @@
     </w:tbl>
     <w:p>
       <w:pPr>
-        <w:spacing w:before="360" w:after="360"/>
+        <w:spacing w:before="320" w:after="320"/>
         <w:jc w:val="center"/>
       </w:pPr>
       <w:r>
@@ -3170,7 +3219,96 @@
           <w:color w:val="113366"/>
           <w:sz w:val="30"/>
         </w:rPr>
-        <w:t>9. Conclusions</w:t>
+        <w:t>9. Source Code Repository and Pull Request Verification</w:t>
+      </w:r>
+    </w:p>
+    <w:p>
+      <w:r>
+        <w:t>All source code, configuration files, templates, stylesheets, tests, and documentation are committed and pushed to the official GitHub repository for the course:</w:t>
+        <w:br/>
+        <w:t>• Repository URL: https://github.com/adilkhanakishev/spring-lab-01</w:t>
+        <w:br/>
+        <w:t>• Work Branch: lab05</w:t>
+        <w:br/>
+        <w:t>• Official Pull Request: https://github.com/adilkhanakishev/spring-lab-01/pull/4</w:t>
+        <w:br/>
+        <w:t>The pull request compares branch lab05 against base branch main and contains all 21 changed files.</w:t>
+      </w:r>
+    </w:p>
+    <w:p>
+      <w:pPr>
+        <w:spacing w:before="120"/>
+      </w:pPr>
+    </w:p>
+    <w:p>
+      <w:pPr>
+        <w:spacing w:after="60"/>
+        <w:jc w:val="center"/>
+      </w:pPr>
+    </w:p>
+    <w:p>
+      <w:r>
+        <w:drawing>
+          <wp:inline xmlns:a="http://schemas.openxmlformats.org/drawingml/2006/main" xmlns:pic="http://schemas.openxmlformats.org/drawingml/2006/picture">
+            <wp:extent cx="5669280" cy="3017341"/>
+            <wp:docPr id="9" name="Picture 9"/>
+            <wp:cNvGraphicFramePr>
+              <a:graphicFrameLocks noChangeAspect="1"/>
+            </wp:cNvGraphicFramePr>
+            <a:graphic>
+              <a:graphicData uri="http://schemas.openxmlformats.org/drawingml/2006/picture">
+                <pic:pic>
+                  <pic:nvPicPr>
+                    <pic:cNvPr id="0" name="screenshot_github_pr.png"/>
+                    <pic:cNvPicPr/>
+                  </pic:nvPicPr>
+                  <pic:blipFill>
+                    <a:blip r:embed="rId17"/>
+                    <a:stretch>
+                      <a:fillRect/>
+                    </a:stretch>
+                  </pic:blipFill>
+                  <pic:spPr>
+                    <a:xfrm>
+                      <a:off x="0" y="0"/>
+                      <a:ext cx="5669280" cy="3017341"/>
+                    </a:xfrm>
+                    <a:prstGeom prst="rect"/>
+                  </pic:spPr>
+                </pic:pic>
+              </a:graphicData>
+            </a:graphic>
+          </wp:inline>
+        </w:drawing>
+      </w:r>
+    </w:p>
+    <w:p>
+      <w:pPr>
+        <w:spacing w:after="160"/>
+        <w:jc w:val="center"/>
+      </w:pPr>
+      <w:r>
+        <w:rPr>
+          <w:b/>
+          <w:color w:val="334455"/>
+          <w:sz w:val="19"/>
+        </w:rPr>
+        <w:t>Figure 9: Official GitHub Pull Request #4 (lab05 -&gt; main) with all 21 modified files and commit history</w:t>
+      </w:r>
+    </w:p>
+    <w:p>
+      <w:pPr>
+        <w:keepNext/>
+        <w:spacing w:before="280" w:after="120"/>
+      </w:pPr>
+      <w:r>
+        <w:rPr>
+          <w:rFonts w:ascii="Calibri" w:hAnsi="Calibri"/>
+          <w:b/>
+          <w:color w:val="113366"/>
+          <w:sz w:val="30"/>
+        </w:rPr>
+        <w:t>10. Conclusions</w:t>
       </w:r>
     </w:p>
     <w:p>
@@ -3196,7 +3334,7 @@
           <w:color w:val="113366"/>
           <w:sz w:val="30"/>
         </w:rPr>
-        <w:t>10. Answers to Demonstration and Defence Questions</w:t>
+        <w:t>11. Answers to Demonstration and Defence Questions</w:t>
       </w:r>
     </w:p>
     <w:p>

</xml_diff>